<commit_message>
docs: corregir citas y ajustar pies de capturas 5 y 6 en informe Laravel
</commit_message>
<xml_diff>
--- a/PAFINAL_DiegoSolanoCastro_Laravel.docx
+++ b/PAFINAL_DiegoSolanoCastro_Laravel.docx
@@ -1810,8 +1810,6 @@
         <w:t>1. Laravel. (2024). Laravel 11.x and 12.x Documentation. Taylor Otwell. https://laravel.com/docs</w:t>
         <w:br/>
         <w:t>2. Bootstrap. (2024). Bootstrap 5.3 Documentation. Twitter / The Bootstrap Authors. https://getbootstrap.com/docs</w:t>
-        <w:br/>
-        <w:t>3. Otway, S. (2023). RESTful architecture and MVC patterns in modern web frameworks. Journal of Software Engineering, 45(2), 112-128.</w:t>
       </w:r>
     </w:p>
     <w:p>
@@ -2283,7 +2281,7 @@
           <w:color w:val="64748B"/>
           <w:sz w:val="23"/>
         </w:rPr>
-        <w:t>Confirmación y Trazabilidad de una Reserva</w:t>
+        <w:t>Confirmación de Reserva Exitosa</w:t>
       </w:r>
     </w:p>
     <w:p>
@@ -2337,7 +2335,7 @@
           <w:color w:val="64748B"/>
           <w:sz w:val="19"/>
         </w:rPr>
-        <w:t>Figura: Confirmación y Trazabilidad de una Reserva</w:t>
+        <w:t>Figura: Confirmación de Reserva Exitosa</w:t>
       </w:r>
     </w:p>
     <w:p>
@@ -2350,7 +2348,7 @@
           <w:rFonts w:ascii="Arial" w:hAnsi="Arial"/>
           <w:sz w:val="22"/>
         </w:rPr>
-        <w:t>Detalle del sistema al confirmarse una reserva exitosa de alimentos por parte de un comedor. El estado del alimento cambia de forma automática de disponible a reservada en la base de datos.</w:t>
+        <w:t>Detalle del sistema al confirmarse una reserva exitosa de alimentos por parte de un comedor. Se observa el mensaje de éxito verde en la parte superior que indica '¡Donación reservada con éxito! Por favor coordine el recojo.'</w:t>
       </w:r>
     </w:p>
     <w:p>
@@ -2365,7 +2363,7 @@
           <w:color w:val="64748B"/>
           <w:sz w:val="23"/>
         </w:rPr>
-        <w:t>Historial y Gestión de Reservas por Estado</w:t>
+        <w:t>Listado de Reservas de la Organización</w:t>
       </w:r>
     </w:p>
     <w:p>
@@ -2419,7 +2417,7 @@
           <w:color w:val="64748B"/>
           <w:sz w:val="19"/>
         </w:rPr>
-        <w:t>Figura: Historial y Gestión de Reservas por Estado</w:t>
+        <w:t>Figura: Listado de Reservas de la Organización</w:t>
       </w:r>
     </w:p>
     <w:p>
@@ -2432,7 +2430,7 @@
           <w:rFonts w:ascii="Arial" w:hAnsi="Arial"/>
           <w:sz w:val="22"/>
         </w:rPr>
-        <w:t>Muestra la lista de reservas registradas para la organización con su estado actual (Pendiente, Completada, Cancelada) y botones de acción rápida para gestionar el recojo.</w:t>
+        <w:t>Detalle de la tabla en el panel de la organización, donde se visualiza el registro de los alimentos reservados con su estado inicial de 'pendiente', en espera del recojo físico coordinado con el donante.</w:t>
       </w:r>
     </w:p>
     <w:sectPr>

</xml_diff>